<commit_message>
Add lithium-ion battery details to sample-handover letters
Co-Authored-By: Claude Opus 5.5 <noreply@anthropic.com>
Claude-Session: https://claude.ai/code/session_01GKu7CH8Xd5nHzsbPWiZVin
</commit_message>
<xml_diff>
--- a/Deliverables/Surat_Keterangan_Sampel_GLD_ke_Bea_Cukai.docx
+++ b/Deliverables/Surat_Keterangan_Sampel_GLD_ke_Bea_Cukai.docx
@@ -91,7 +91,7 @@
         </w:rPr>
         <w:t>Lampiran</w:t>
         <w:tab/>
-        <w:t>: 3 (tiga) berkas</w:t>
+        <w:t>: 4 (empat) berkas</w:t>
       </w:r>
     </w:p>
     <w:p>
@@ -461,9 +461,34 @@
             <w:r>
               <w:rPr>
                 <w:sz w:val="20"/>
+              </w:rPr>
+              <w:t xml:space="preserve">Litium-ion, 7 sel 18650 paralel (1S7P, nominal 3,7 V), terpasang di dalam alat (UN 3481, baterai litium-ion dalam peralatan). Kapasitas: </w:t>
+            </w:r>
+            <w:r>
+              <w:rPr>
+                <w:sz w:val="20"/>
                 <w:highlight w:val="yellow"/>
               </w:rPr>
-              <w:t>[Konfirmasi: tidak berisi baterai litium / ATAU sebutkan jenis dan kapasitas Wh]</w:t>
+              <w:t>[… mAh per sel → … Wh total]</w:t>
+            </w:r>
+            <w:r>
+              <w:rPr>
+                <w:sz w:val="20"/>
+              </w:rPr>
+              <w:t xml:space="preserve">. Alat dalam keadaan mati dan terlindung dari hubung singkat serta aktivasi tidak sengaja selama perjalanan. Ringkasan uji UN 38.3: </w:t>
+            </w:r>
+            <w:r>
+              <w:rPr>
+                <w:sz w:val="20"/>
+                <w:highlight w:val="yellow"/>
+              </w:rPr>
+              <w:t>[dilampirkan / menyusul]</w:t>
+            </w:r>
+            <w:r>
+              <w:rPr>
+                <w:sz w:val="20"/>
+              </w:rPr>
+              <w:t>.</w:t>
             </w:r>
           </w:p>
         </w:tc>
@@ -921,7 +946,22 @@
           <w:b w:val="0"/>
           <w:sz w:val="19"/>
         </w:rPr>
-        <w:t>Lampiran: (1) foto sampel alat; (2) salinan formulir aplikasi sertifikasi ATEX; (3) salinan paspor pembawa barang.</w:t>
+        <w:t xml:space="preserve">Lampiran: (1) foto sampel alat; (2) salinan formulir aplikasi sertifikasi ATEX; (3) salinan paspor pembawa barang; (4) </w:t>
+      </w:r>
+      <w:r>
+        <w:rPr>
+          <w:b w:val="0"/>
+          <w:sz w:val="19"/>
+          <w:highlight w:val="yellow"/>
+        </w:rPr>
+        <w:t>[ringkasan uji UN 38.3 sel baterai]</w:t>
+      </w:r>
+      <w:r>
+        <w:rPr>
+          <w:b w:val="0"/>
+          <w:sz w:val="19"/>
+        </w:rPr>
+        <w:t>.</w:t>
       </w:r>
     </w:p>
     <w:p>

</xml_diff>